<commit_message>
modificaciones en archivo Semana 1 2
</commit_message>
<xml_diff>
--- a/Semana_1_2.docx
+++ b/Semana_1_2.docx
@@ -1182,27 +1182,6 @@
         <w:jc w:val="left"/>
         <w:rPr>
           <w:rFonts w:ascii="Google Sans;sans-serif" w:hAnsi="Google Sans;sans-serif"/>
-          <w:b w:val="false"/>
-          <w:strike w:val="false"/>
-          <w:dstrike w:val="false"/>
-          <w:sz w:val="24"/>
-          <w:u w:val="none"/>
-          <w:effect w:val="none"/>
-        </w:rPr>
-      </w:pPr>
-      <w:r>
-        <w:rPr/>
-      </w:r>
-    </w:p>
-    <w:p>
-      <w:pPr>
-        <w:pStyle w:val="Normal"/>
-        <w:bidi w:val="0"/>
-        <w:spacing w:before="0" w:after="0"/>
-        <w:ind w:left="0" w:right="0" w:hanging="0"/>
-        <w:jc w:val="left"/>
-        <w:rPr>
-          <w:rFonts w:ascii="Google Sans;sans-serif" w:hAnsi="Google Sans;sans-serif"/>
           <w:b/>
           <w:b/>
           <w:bCs/>
@@ -1462,27 +1441,6 @@
         <w:jc w:val="left"/>
         <w:rPr>
           <w:rFonts w:ascii="Google Sans;sans-serif" w:hAnsi="Google Sans;sans-serif"/>
-          <w:b w:val="false"/>
-          <w:strike w:val="false"/>
-          <w:dstrike w:val="false"/>
-          <w:sz w:val="24"/>
-          <w:u w:val="none"/>
-          <w:effect w:val="none"/>
-        </w:rPr>
-      </w:pPr>
-      <w:r>
-        <w:rPr/>
-      </w:r>
-    </w:p>
-    <w:p>
-      <w:pPr>
-        <w:pStyle w:val="Normal"/>
-        <w:bidi w:val="0"/>
-        <w:spacing w:before="0" w:after="0"/>
-        <w:ind w:left="0" w:right="0" w:hanging="0"/>
-        <w:jc w:val="left"/>
-        <w:rPr>
-          <w:rFonts w:ascii="Google Sans;sans-serif" w:hAnsi="Google Sans;sans-serif"/>
           <w:b/>
           <w:b/>
           <w:bCs/>
@@ -1742,7 +1700,31 @@
           <w:u w:val="none"/>
           <w:effect w:val="none"/>
         </w:rPr>
-        <w:t xml:space="preserve"> Es la velocidad real a la que viaja la información (el pulso o el "chirp" de tu sondador). Esta velocidad es siempre </w:t>
+        <w:t xml:space="preserve"> Es la velocidad real a la que viaja la información (el pulso o el "chirp" de </w:t>
+      </w:r>
+      <w:r>
+        <w:rPr>
+          <w:rFonts w:ascii="Google Sans;sans-serif" w:hAnsi="Google Sans;sans-serif"/>
+          <w:b w:val="false"/>
+          <w:strike w:val="false"/>
+          <w:dstrike w:val="false"/>
+          <w:sz w:val="24"/>
+          <w:u w:val="none"/>
+          <w:effect w:val="none"/>
+        </w:rPr>
+        <w:t>un</w:t>
+      </w:r>
+      <w:r>
+        <w:rPr>
+          <w:rFonts w:ascii="Google Sans;sans-serif" w:hAnsi="Google Sans;sans-serif"/>
+          <w:b w:val="false"/>
+          <w:strike w:val="false"/>
+          <w:dstrike w:val="false"/>
+          <w:sz w:val="24"/>
+          <w:u w:val="none"/>
+          <w:effect w:val="none"/>
+        </w:rPr>
+        <w:t xml:space="preserve"> sondador). Esta velocidad es siempre </w:t>
       </w:r>
       <w:r>
         <w:rPr>
@@ -1935,7 +1917,7 @@
           <w:u w:val="none"/>
           <w:effect w:val="none"/>
         </w:rPr>
-        <w:t xml:space="preserve"> del reflejo. Este es el parámetro fundamental que graficará tu sondador.</w:t>
+        <w:t xml:space="preserve"> del reflejo.</w:t>
       </w:r>
     </w:p>
     <w:p>
@@ -2037,32 +2019,7 @@
           <w:u w:val="none"/>
           <w:effect w:val="none"/>
         </w:rPr>
-        <w:t xml:space="preserve">Cuando el plasma ionosférico no es homogéneo y presenta perturbaciones, burbujas o "nubes" de electrones (como en el fenómeno de la capa </w:t>
-      </w:r>
-      <w:r>
-        <w:rPr>
-          <w:rStyle w:val="Emphasis"/>
-          <w:rFonts w:ascii="Google Sans;sans-serif" w:hAnsi="Google Sans;sans-serif"/>
-          <w:b w:val="false"/>
-          <w:strike w:val="false"/>
-          <w:dstrike w:val="false"/>
-          <w:sz w:val="24"/>
-          <w:u w:val="none"/>
-          <w:effect w:val="none"/>
-        </w:rPr>
-        <w:t>E esporádica</w:t>
-      </w:r>
-      <w:r>
-        <w:rPr>
-          <w:rFonts w:ascii="Google Sans;sans-serif" w:hAnsi="Google Sans;sans-serif"/>
-          <w:b w:val="false"/>
-          <w:strike w:val="false"/>
-          <w:dstrike w:val="false"/>
-          <w:sz w:val="24"/>
-          <w:u w:val="none"/>
-          <w:effect w:val="none"/>
-        </w:rPr>
-        <w:t xml:space="preserve">), las ondas de radio sufren fenómenos de </w:t>
+        <w:t xml:space="preserve">Cuando el plasma ionosférico no es homogéneo y presenta perturbaciones, burbujas o "nubes" de electrones, las ondas de radio sufren fenómenos de </w:t>
       </w:r>
       <w:r>
         <w:rPr>
@@ -2286,18 +2243,20 @@
           <w:b/>
           <w:strike w:val="false"/>
           <w:dstrike w:val="false"/>
-          <w:sz w:val="36"/>
-          <w:u w:val="none"/>
-          <w:effect w:val="none"/>
-        </w:rPr>
-      </w:pPr>
-      <w:r>
-        <w:rPr>
-          <w:rFonts w:ascii="Google Sans;sans-serif" w:hAnsi="Google Sans;sans-serif"/>
-          <w:b/>
-          <w:strike w:val="false"/>
-          <w:dstrike w:val="false"/>
-          <w:sz w:val="36"/>
+          <w:sz w:val="28"/>
+          <w:szCs w:val="28"/>
+          <w:u w:val="none"/>
+          <w:effect w:val="none"/>
+        </w:rPr>
+      </w:pPr>
+      <w:r>
+        <w:rPr>
+          <w:rFonts w:ascii="Google Sans;sans-serif" w:hAnsi="Google Sans;sans-serif"/>
+          <w:b/>
+          <w:strike w:val="false"/>
+          <w:dstrike w:val="false"/>
+          <w:sz w:val="28"/>
+          <w:szCs w:val="28"/>
           <w:u w:val="none"/>
           <w:effect w:val="none"/>
         </w:rPr>
@@ -2678,7 +2637,31 @@
           <w:u w:val="none"/>
           <w:effect w:val="none"/>
         </w:rPr>
-        <w:t>Monitoreo de extensas áreas ionosféricas remotas (más allá del horizonte) desde una única estación terrestre.</w:t>
+        <w:t>Monitore</w:t>
+      </w:r>
+      <w:r>
+        <w:rPr>
+          <w:rFonts w:ascii="Google Sans;sans-serif" w:hAnsi="Google Sans;sans-serif"/>
+          <w:b w:val="false"/>
+          <w:strike w:val="false"/>
+          <w:dstrike w:val="false"/>
+          <w:sz w:val="24"/>
+          <w:u w:val="none"/>
+          <w:effect w:val="none"/>
+        </w:rPr>
+        <w:t xml:space="preserve">a </w:t>
+      </w:r>
+      <w:r>
+        <w:rPr>
+          <w:rFonts w:ascii="Google Sans;sans-serif" w:hAnsi="Google Sans;sans-serif"/>
+          <w:b w:val="false"/>
+          <w:strike w:val="false"/>
+          <w:dstrike w:val="false"/>
+          <w:sz w:val="24"/>
+          <w:u w:val="none"/>
+          <w:effect w:val="none"/>
+        </w:rPr>
+        <w:t>extensas áreas ionosféricas remotas (más allá del horizonte) desde una única estación terrestre.</w:t>
       </w:r>
     </w:p>
     <w:p>
@@ -2688,15 +2671,19 @@
         <w:spacing w:before="360" w:after="180"/>
         <w:ind w:left="0" w:right="0" w:hanging="0"/>
         <w:jc w:val="left"/>
-        <w:rPr/>
-      </w:pPr>
-      <w:r>
-        <w:rPr>
-          <w:rFonts w:ascii="Google Sans;sans-serif" w:hAnsi="Google Sans;sans-serif"/>
-          <w:b/>
-          <w:strike w:val="false"/>
-          <w:dstrike w:val="false"/>
-          <w:sz w:val="36"/>
+        <w:rPr>
+          <w:sz w:val="28"/>
+          <w:szCs w:val="28"/>
+        </w:rPr>
+      </w:pPr>
+      <w:r>
+        <w:rPr>
+          <w:rFonts w:ascii="Google Sans;sans-serif" w:hAnsi="Google Sans;sans-serif"/>
+          <w:b/>
+          <w:strike w:val="false"/>
+          <w:dstrike w:val="false"/>
+          <w:sz w:val="28"/>
+          <w:szCs w:val="28"/>
           <w:u w:val="none"/>
           <w:effect w:val="none"/>
         </w:rPr>
@@ -2799,7 +2786,19 @@
           <w:u w:val="none"/>
           <w:effect w:val="none"/>
         </w:rPr>
-        <w:t>Técnica histórica y base de las primeras ionosondas; precisa pero requiere hardware complejo y costoso de alta potencia.</w:t>
+        <w:t>Es una t</w:t>
+      </w:r>
+      <w:r>
+        <w:rPr>
+          <w:rFonts w:ascii="Google Sans;sans-serif" w:hAnsi="Google Sans;sans-serif"/>
+          <w:b w:val="false"/>
+          <w:strike w:val="false"/>
+          <w:dstrike w:val="false"/>
+          <w:sz w:val="24"/>
+          <w:u w:val="none"/>
+          <w:effect w:val="none"/>
+        </w:rPr>
+        <w:t>écnica histórica y base de las primeras ionosondas; precisa pero requiere hardware complejo y costoso de alta potencia.</w:t>
       </w:r>
     </w:p>
     <w:p>
@@ -2924,7 +2923,55 @@
           <w:u w:val="none"/>
           <w:effect w:val="none"/>
         </w:rPr>
-        <w:t>Es la técnica moderna más eficiente. Permite diseñar sondadores con potencias de transmisión muy bajas (pocos vatios) mediante procesamiento digital de señales (DSP).</w:t>
+        <w:t xml:space="preserve">Es </w:t>
+      </w:r>
+      <w:r>
+        <w:rPr>
+          <w:rFonts w:ascii="Google Sans;sans-serif" w:hAnsi="Google Sans;sans-serif"/>
+          <w:b w:val="false"/>
+          <w:strike w:val="false"/>
+          <w:dstrike w:val="false"/>
+          <w:sz w:val="24"/>
+          <w:u w:val="none"/>
+          <w:effect w:val="none"/>
+        </w:rPr>
+        <w:t>una</w:t>
+      </w:r>
+      <w:r>
+        <w:rPr>
+          <w:rFonts w:ascii="Google Sans;sans-serif" w:hAnsi="Google Sans;sans-serif"/>
+          <w:b w:val="false"/>
+          <w:strike w:val="false"/>
+          <w:dstrike w:val="false"/>
+          <w:sz w:val="24"/>
+          <w:u w:val="none"/>
+          <w:effect w:val="none"/>
+        </w:rPr>
+        <w:t xml:space="preserve"> técnica moderna </w:t>
+      </w:r>
+      <w:r>
+        <w:rPr>
+          <w:rFonts w:ascii="Google Sans;sans-serif" w:hAnsi="Google Sans;sans-serif"/>
+          <w:b w:val="false"/>
+          <w:strike w:val="false"/>
+          <w:dstrike w:val="false"/>
+          <w:sz w:val="24"/>
+          <w:u w:val="none"/>
+          <w:effect w:val="none"/>
+        </w:rPr>
+        <w:t>muy</w:t>
+      </w:r>
+      <w:r>
+        <w:rPr>
+          <w:rFonts w:ascii="Google Sans;sans-serif" w:hAnsi="Google Sans;sans-serif"/>
+          <w:b w:val="false"/>
+          <w:strike w:val="false"/>
+          <w:dstrike w:val="false"/>
+          <w:sz w:val="24"/>
+          <w:u w:val="none"/>
+          <w:effect w:val="none"/>
+        </w:rPr>
+        <w:t xml:space="preserve"> eficiente. Permite diseñar sondadores con potencias de transmisión muy bajas (pocos vatios) mediante procesamiento digital de señales (DSP).</w:t>
       </w:r>
     </w:p>
     <w:p>
@@ -3049,7 +3096,19 @@
           <w:u w:val="none"/>
           <w:effect w:val="none"/>
         </w:rPr>
-        <w:t>Técnica avanzada que ofrece una alta inmunidad al ruido y permite la coexistencia de múltiples sondadores en la misma banda de frecuencia.</w:t>
+        <w:t>Es una t</w:t>
+      </w:r>
+      <w:r>
+        <w:rPr>
+          <w:rFonts w:ascii="Google Sans;sans-serif" w:hAnsi="Google Sans;sans-serif"/>
+          <w:b w:val="false"/>
+          <w:strike w:val="false"/>
+          <w:dstrike w:val="false"/>
+          <w:sz w:val="24"/>
+          <w:u w:val="none"/>
+          <w:effect w:val="none"/>
+        </w:rPr>
+        <w:t>écnica avanzada que ofrece una alta inmunidad al ruido y permite la coexistencia de múltiples sondadores en la misma banda de frecuencia.</w:t>
       </w:r>
     </w:p>
     <w:p>
@@ -3059,15 +3118,19 @@
         <w:spacing w:before="360" w:after="180"/>
         <w:ind w:left="0" w:right="0" w:hanging="0"/>
         <w:jc w:val="left"/>
-        <w:rPr/>
-      </w:pPr>
-      <w:r>
-        <w:rPr>
-          <w:rFonts w:ascii="Google Sans;sans-serif" w:hAnsi="Google Sans;sans-serif"/>
-          <w:b/>
-          <w:strike w:val="false"/>
-          <w:dstrike w:val="false"/>
-          <w:sz w:val="36"/>
+        <w:rPr>
+          <w:sz w:val="28"/>
+          <w:szCs w:val="28"/>
+        </w:rPr>
+      </w:pPr>
+      <w:r>
+        <w:rPr>
+          <w:rFonts w:ascii="Google Sans;sans-serif" w:hAnsi="Google Sans;sans-serif"/>
+          <w:b/>
+          <w:strike w:val="false"/>
+          <w:dstrike w:val="false"/>
+          <w:sz w:val="28"/>
+          <w:szCs w:val="28"/>
           <w:u w:val="none"/>
           <w:effect w:val="none"/>
         </w:rPr>
@@ -3170,7 +3233,55 @@
           <w:u w:val="none"/>
           <w:effect w:val="none"/>
         </w:rPr>
-        <w:t>Proporciona el perfil físico más completo (densidad, temperatura electrónica e iónica, velocidad de deriva), alcanzando la ionosfera superior (hasta miles de km de altitud), pero requiere instalaciones gigantescas.</w:t>
+        <w:t xml:space="preserve">Proporciona </w:t>
+      </w:r>
+      <w:r>
+        <w:rPr>
+          <w:rFonts w:ascii="Google Sans;sans-serif" w:hAnsi="Google Sans;sans-serif"/>
+          <w:b w:val="false"/>
+          <w:strike w:val="false"/>
+          <w:dstrike w:val="false"/>
+          <w:sz w:val="24"/>
+          <w:u w:val="none"/>
+          <w:effect w:val="none"/>
+        </w:rPr>
+        <w:t>un</w:t>
+      </w:r>
+      <w:r>
+        <w:rPr>
+          <w:rFonts w:ascii="Google Sans;sans-serif" w:hAnsi="Google Sans;sans-serif"/>
+          <w:b w:val="false"/>
+          <w:strike w:val="false"/>
+          <w:dstrike w:val="false"/>
+          <w:sz w:val="24"/>
+          <w:u w:val="none"/>
+          <w:effect w:val="none"/>
+        </w:rPr>
+        <w:t xml:space="preserve"> perfil físico </w:t>
+      </w:r>
+      <w:r>
+        <w:rPr>
+          <w:rFonts w:ascii="Google Sans;sans-serif" w:hAnsi="Google Sans;sans-serif"/>
+          <w:b w:val="false"/>
+          <w:strike w:val="false"/>
+          <w:dstrike w:val="false"/>
+          <w:sz w:val="24"/>
+          <w:u w:val="none"/>
+          <w:effect w:val="none"/>
+        </w:rPr>
+        <w:t>bastante</w:t>
+      </w:r>
+      <w:r>
+        <w:rPr>
+          <w:rFonts w:ascii="Google Sans;sans-serif" w:hAnsi="Google Sans;sans-serif"/>
+          <w:b w:val="false"/>
+          <w:strike w:val="false"/>
+          <w:dstrike w:val="false"/>
+          <w:sz w:val="24"/>
+          <w:u w:val="none"/>
+          <w:effect w:val="none"/>
+        </w:rPr>
+        <w:t xml:space="preserve"> completo (densidad, temperatura electrónica e iónica, velocidad de deriva), alcanzando la ionosfera superior (hasta miles de km de altitud), pero requiere instalaciones gigantescas.</w:t>
       </w:r>
     </w:p>
     <w:p>
@@ -3330,15 +3441,19 @@
         <w:spacing w:before="360" w:after="180"/>
         <w:ind w:left="0" w:right="0" w:hanging="0"/>
         <w:jc w:val="left"/>
-        <w:rPr/>
-      </w:pPr>
-      <w:r>
-        <w:rPr>
-          <w:rFonts w:ascii="Google Sans;sans-serif" w:hAnsi="Google Sans;sans-serif"/>
-          <w:b/>
-          <w:strike w:val="false"/>
-          <w:dstrike w:val="false"/>
-          <w:sz w:val="36"/>
+        <w:rPr>
+          <w:sz w:val="28"/>
+          <w:szCs w:val="28"/>
+        </w:rPr>
+      </w:pPr>
+      <w:r>
+        <w:rPr>
+          <w:rFonts w:ascii="Google Sans;sans-serif" w:hAnsi="Google Sans;sans-serif"/>
+          <w:b/>
+          <w:strike w:val="false"/>
+          <w:dstrike w:val="false"/>
+          <w:sz w:val="28"/>
+          <w:szCs w:val="28"/>
           <w:u w:val="none"/>
           <w:effect w:val="none"/>
         </w:rPr>
@@ -3780,18 +3895,20 @@
           <w:b/>
           <w:strike w:val="false"/>
           <w:dstrike w:val="false"/>
-          <w:sz w:val="36"/>
-          <w:u w:val="none"/>
-          <w:effect w:val="none"/>
-        </w:rPr>
-      </w:pPr>
-      <w:r>
-        <w:rPr>
-          <w:rFonts w:ascii="Google Sans;sans-serif" w:hAnsi="Google Sans;sans-serif"/>
-          <w:b/>
-          <w:strike w:val="false"/>
-          <w:dstrike w:val="false"/>
-          <w:sz w:val="36"/>
+          <w:sz w:val="28"/>
+          <w:szCs w:val="28"/>
+          <w:u w:val="none"/>
+          <w:effect w:val="none"/>
+        </w:rPr>
+      </w:pPr>
+      <w:r>
+        <w:rPr>
+          <w:rFonts w:ascii="Google Sans;sans-serif" w:hAnsi="Google Sans;sans-serif"/>
+          <w:b/>
+          <w:strike w:val="false"/>
+          <w:dstrike w:val="false"/>
+          <w:sz w:val="28"/>
+          <w:szCs w:val="28"/>
           <w:u w:val="none"/>
           <w:effect w:val="none"/>
         </w:rPr>
@@ -3803,7 +3920,8 @@
           <w:b/>
           <w:strike w:val="false"/>
           <w:dstrike w:val="false"/>
-          <w:sz w:val="36"/>
+          <w:sz w:val="28"/>
+          <w:szCs w:val="28"/>
           <w:u w:val="none"/>
           <w:effect w:val="none"/>
         </w:rPr>
@@ -3990,18 +4108,20 @@
           <w:b/>
           <w:strike w:val="false"/>
           <w:dstrike w:val="false"/>
-          <w:sz w:val="36"/>
-          <w:u w:val="none"/>
-          <w:effect w:val="none"/>
-        </w:rPr>
-      </w:pPr>
-      <w:r>
-        <w:rPr>
-          <w:rFonts w:ascii="Google Sans;sans-serif" w:hAnsi="Google Sans;sans-serif"/>
-          <w:b/>
-          <w:strike w:val="false"/>
-          <w:dstrike w:val="false"/>
-          <w:sz w:val="36"/>
+          <w:sz w:val="28"/>
+          <w:szCs w:val="28"/>
+          <w:u w:val="none"/>
+          <w:effect w:val="none"/>
+        </w:rPr>
+      </w:pPr>
+      <w:r>
+        <w:rPr>
+          <w:rFonts w:ascii="Google Sans;sans-serif" w:hAnsi="Google Sans;sans-serif"/>
+          <w:b/>
+          <w:strike w:val="false"/>
+          <w:dstrike w:val="false"/>
+          <w:sz w:val="28"/>
+          <w:szCs w:val="28"/>
           <w:u w:val="none"/>
           <w:effect w:val="none"/>
         </w:rPr>
@@ -4577,58 +4697,6 @@
           <w:effect w:val="none"/>
         </w:rPr>
         <w:t xml:space="preserve"> Muy alta. Requiere sintetizadores de frecuencia digitales ultra-rápidos (DDS) coordinados con convertidores analógico-digitales (ADC) de alta velocidad para resolver simultáneamente la altitud virtual y el desplazamiento Doppler del plasma.</w:t>
-      </w:r>
-    </w:p>
-    <w:p>
-      <w:pPr>
-        <w:pStyle w:val="TextBody"/>
-        <w:pBdr/>
-        <w:bidi w:val="0"/>
-        <w:spacing w:before="0" w:after="0"/>
-        <w:ind w:left="0" w:right="0" w:hanging="0"/>
-        <w:jc w:val="left"/>
-        <w:rPr>
-          <w:b w:val="false"/>
-          <w:sz w:val="24"/>
-        </w:rPr>
-      </w:pPr>
-      <w:r>
-        <w:rPr>
-          <w:rFonts w:ascii="Google Sans;sans-serif" w:hAnsi="Google Sans;sans-serif"/>
-          <w:b/>
-          <w:strike w:val="false"/>
-          <w:dstrike w:val="false"/>
-          <w:sz w:val="36"/>
-          <w:u w:val="none"/>
-          <w:effect w:val="none"/>
-        </w:rPr>
-      </w:r>
-    </w:p>
-    <w:p>
-      <w:pPr>
-        <w:pStyle w:val="Normal"/>
-        <w:bidi w:val="0"/>
-        <w:jc w:val="left"/>
-        <w:rPr>
-          <w:rFonts w:ascii="Google Sans;sans-serif" w:hAnsi="Google Sans;sans-serif"/>
-          <w:b/>
-          <w:strike w:val="false"/>
-          <w:dstrike w:val="false"/>
-          <w:sz w:val="36"/>
-          <w:u w:val="none"/>
-          <w:effect w:val="none"/>
-        </w:rPr>
-      </w:pPr>
-      <w:r>
-        <w:rPr>
-          <w:rFonts w:ascii="Google Sans;sans-serif" w:hAnsi="Google Sans;sans-serif"/>
-          <w:b/>
-          <w:strike w:val="false"/>
-          <w:dstrike w:val="false"/>
-          <w:sz w:val="36"/>
-          <w:u w:val="none"/>
-          <w:effect w:val="none"/>
-        </w:rPr>
       </w:r>
     </w:p>
     <w:sectPr>

</xml_diff>